<commit_message>
Updated HOT 2 rubric
</commit_message>
<xml_diff>
--- a/HTML_CSS/HandsOnTests/HOT2/HOT2 - Chapters 1-4.docx
+++ b/HTML_CSS/HandsOnTests/HOT2/HOT2 - Chapters 1-4.docx
@@ -1355,6 +1355,15 @@
         </w:rPr>
         <w:t xml:space="preserve">Make the image responsive so that it resizes to accommodate the browser window. </w:t>
       </w:r>
+      <w:r>
+        <w:rPr>
+          <w:rFonts w:ascii="Google Sans Text" w:eastAsia="Google Sans Text" w:hAnsi="Google Sans Text" w:cs="Google Sans Text"/>
+          <w:b/>
+          <w:bCs/>
+          <w:color w:val="EE0000"/>
+        </w:rPr>
+        <w:t>-2pts</w:t>
+      </w:r>
     </w:p>
     <w:p>
       <w:pPr>
@@ -1982,6 +1991,7 @@
           <w:rFonts w:ascii="Google Sans Text" w:eastAsia="Google Sans Text" w:hAnsi="Google Sans Text" w:cs="Google Sans Text"/>
           <w:color w:val="1B1C1D"/>
         </w:rPr>
+        <w:lastRenderedPageBreak/>
         <w:t>Style the</w:t>
       </w:r>
       <w:r>
@@ -1992,7 +2002,6 @@
           <w:rFonts w:ascii="Google Sans Text" w:eastAsia="Google Sans Text" w:hAnsi="Google Sans Text" w:cs="Google Sans Text"/>
           <w:shd w:val="clear" w:color="auto" w:fill="FFF2CC"/>
         </w:rPr>
-        <w:lastRenderedPageBreak/>
         <w:t>&lt;span&gt;</w:t>
       </w:r>
       <w:r>

</xml_diff>